<commit_message>
# FastAPI Request Parameter Handling: Path + Query + Request Body
</commit_message>
<xml_diff>
--- a/notes/FastAPI notes.docx
+++ b/notes/FastAPI notes.docx
@@ -4028,21 +4028,7 @@
           <w:sz w:val="24"/>
           <w:szCs w:val="24"/>
         </w:rPr>
-        <w:t>set</w:t>
-      </w:r>
-      <w:r>
-        <w:rPr>
-          <w:sz w:val="24"/>
-          <w:szCs w:val="24"/>
-        </w:rPr>
-        <w:t xml:space="preserve"> an Optional Parameter </w:t>
-      </w:r>
-      <w:r>
-        <w:rPr>
-          <w:sz w:val="24"/>
-          <w:szCs w:val="24"/>
-        </w:rPr>
-        <w:t>value</w:t>
+        <w:t>set an Optional Parameter value</w:t>
       </w:r>
     </w:p>
     <w:p>
@@ -5845,14 +5831,7 @@
           <w:sz w:val="24"/>
           <w:szCs w:val="24"/>
         </w:rPr>
-        <w:t>No</w:t>
-      </w:r>
-      <w:r>
-        <w:rPr>
-          <w:sz w:val="24"/>
-          <w:szCs w:val="24"/>
-        </w:rPr>
-        <w:t xml:space="preserve"> para limit, </w:t>
+        <w:t xml:space="preserve">No para limit, </w:t>
       </w:r>
       <w:proofErr w:type="spellStart"/>
       <w:r>
@@ -5892,21 +5871,7 @@
           <w:sz w:val="24"/>
           <w:szCs w:val="24"/>
         </w:rPr>
-        <w:t xml:space="preserve">: </w:t>
-      </w:r>
-      <w:r>
-        <w:rPr>
-          <w:sz w:val="24"/>
-          <w:szCs w:val="24"/>
-        </w:rPr>
-        <w:t xml:space="preserve">No </w:t>
-      </w:r>
-      <w:r>
-        <w:rPr>
-          <w:sz w:val="24"/>
-          <w:szCs w:val="24"/>
-        </w:rPr>
-        <w:t xml:space="preserve">data validation </w:t>
+        <w:t xml:space="preserve">: No data validation </w:t>
       </w:r>
     </w:p>
     <w:p>
@@ -6804,7 +6769,110 @@
           <w:highlight w:val="yellow"/>
         </w:rPr>
         <w:lastRenderedPageBreak/>
-        <w:t>API CRUD:</w:t>
+        <w:t>API CRUD</w:t>
+      </w:r>
+      <w:r>
+        <w:rPr>
+          <w:b/>
+          <w:bCs/>
+          <w:color w:val="385623" w:themeColor="accent6" w:themeShade="80"/>
+          <w:sz w:val="30"/>
+          <w:szCs w:val="30"/>
+          <w:highlight w:val="yellow"/>
+        </w:rPr>
+        <w:t xml:space="preserve"> using </w:t>
+      </w:r>
+      <w:r>
+        <w:rPr>
+          <w:b/>
+          <w:bCs/>
+          <w:color w:val="385623" w:themeColor="accent6" w:themeShade="80"/>
+          <w:sz w:val="30"/>
+          <w:szCs w:val="30"/>
+          <w:highlight w:val="yellow"/>
+        </w:rPr>
+        <w:t>[</w:t>
+      </w:r>
+      <w:r>
+        <w:rPr>
+          <w:b/>
+          <w:bCs/>
+          <w:color w:val="385623" w:themeColor="accent6" w:themeShade="80"/>
+          <w:sz w:val="30"/>
+          <w:szCs w:val="30"/>
+          <w:highlight w:val="yellow"/>
+        </w:rPr>
+        <w:t xml:space="preserve">GET, POST, </w:t>
+      </w:r>
+      <w:proofErr w:type="gramStart"/>
+      <w:r>
+        <w:rPr>
+          <w:b/>
+          <w:bCs/>
+          <w:color w:val="385623" w:themeColor="accent6" w:themeShade="80"/>
+          <w:sz w:val="30"/>
+          <w:szCs w:val="30"/>
+          <w:highlight w:val="yellow"/>
+        </w:rPr>
+        <w:t>PUT</w:t>
+      </w:r>
+      <w:r>
+        <w:rPr>
+          <w:b/>
+          <w:bCs/>
+          <w:color w:val="385623" w:themeColor="accent6" w:themeShade="80"/>
+          <w:sz w:val="30"/>
+          <w:szCs w:val="30"/>
+          <w:highlight w:val="yellow"/>
+        </w:rPr>
+        <w:t>,DELETE</w:t>
+      </w:r>
+      <w:proofErr w:type="gramEnd"/>
+      <w:r>
+        <w:rPr>
+          <w:b/>
+          <w:bCs/>
+          <w:color w:val="385623" w:themeColor="accent6" w:themeShade="80"/>
+          <w:sz w:val="30"/>
+          <w:szCs w:val="30"/>
+          <w:highlight w:val="yellow"/>
+        </w:rPr>
+        <w:t xml:space="preserve"> &amp; </w:t>
+      </w:r>
+      <w:proofErr w:type="spellStart"/>
+      <w:r>
+        <w:rPr>
+          <w:b/>
+          <w:bCs/>
+          <w:color w:val="385623" w:themeColor="accent6" w:themeShade="80"/>
+          <w:sz w:val="30"/>
+          <w:szCs w:val="30"/>
+          <w:highlight w:val="yellow"/>
+        </w:rPr>
+        <w:t>Pydantic</w:t>
+      </w:r>
+      <w:proofErr w:type="spellEnd"/>
+      <w:r>
+        <w:rPr>
+          <w:b/>
+          <w:bCs/>
+          <w:color w:val="385623" w:themeColor="accent6" w:themeShade="80"/>
+          <w:sz w:val="30"/>
+          <w:szCs w:val="30"/>
+          <w:highlight w:val="yellow"/>
+        </w:rPr>
+        <w:t>]</w:t>
+      </w:r>
+      <w:r>
+        <w:rPr>
+          <w:b/>
+          <w:bCs/>
+          <w:color w:val="385623" w:themeColor="accent6" w:themeShade="80"/>
+          <w:sz w:val="30"/>
+          <w:szCs w:val="30"/>
+          <w:highlight w:val="yellow"/>
+        </w:rPr>
+        <w:t>:</w:t>
       </w:r>
     </w:p>
     <w:p>
@@ -6917,11 +6985,17 @@
         <w:rPr>
           <w:noProof/>
         </w:rPr>
+        <w:t xml:space="preserve"> </w:t>
+      </w:r>
+      <w:r>
+        <w:rPr>
+          <w:noProof/>
+        </w:rPr>
         <w:drawing>
-          <wp:inline distT="0" distB="0" distL="0" distR="0" wp14:anchorId="23EFC5C9" wp14:editId="07DAA9F8">
-            <wp:extent cx="5943600" cy="1967230"/>
+          <wp:inline distT="0" distB="0" distL="0" distR="0" wp14:anchorId="5EA2FD2A" wp14:editId="2DD72241">
+            <wp:extent cx="4896533" cy="2019582"/>
             <wp:effectExtent l="0" t="0" r="0" b="0"/>
-            <wp:docPr id="33" name="Picture 33"/>
+            <wp:docPr id="34" name="Picture 34"/>
             <wp:cNvGraphicFramePr>
               <a:graphicFrameLocks xmlns:a="http://schemas.openxmlformats.org/drawingml/2006/main" noChangeAspect="1"/>
             </wp:cNvGraphicFramePr>
@@ -6941,7 +7015,7 @@
                   <pic:spPr>
                     <a:xfrm>
                       <a:off x="0" y="0"/>
-                      <a:ext cx="5943600" cy="1967230"/>
+                      <a:ext cx="4896533" cy="2019582"/>
                     </a:xfrm>
                     <a:prstGeom prst="rect">
                       <a:avLst/>
@@ -6953,21 +7027,209 @@
           </wp:inline>
         </w:drawing>
       </w:r>
-      <w:r>
-        <w:rPr>
+    </w:p>
+    <w:p>
+      <w:pPr>
+        <w:rPr>
+          <w:b/>
+          <w:bCs/>
           <w:noProof/>
-        </w:rPr>
-        <w:t xml:space="preserve"> </w:t>
-      </w:r>
-      <w:r>
-        <w:rPr>
+          <w:sz w:val="30"/>
+          <w:szCs w:val="30"/>
+        </w:rPr>
+      </w:pPr>
+      <w:r>
+        <w:rPr>
+          <w:b/>
+          <w:bCs/>
           <w:noProof/>
+          <w:sz w:val="30"/>
+          <w:szCs w:val="30"/>
+        </w:rPr>
+        <w:t xml:space="preserve">PUT </w:t>
+      </w:r>
+      <w:r>
+        <w:rPr>
+          <w:b/>
+          <w:bCs/>
+          <w:noProof/>
+          <w:sz w:val="30"/>
+          <w:szCs w:val="30"/>
+        </w:rPr>
+        <w:tab/>
+      </w:r>
+      <w:r>
+        <w:rPr>
+          <w:b/>
+          <w:bCs/>
+          <w:noProof/>
+          <w:sz w:val="30"/>
+          <w:szCs w:val="30"/>
+        </w:rPr>
+        <w:tab/>
+      </w:r>
+      <w:r>
+        <w:rPr>
+          <w:b/>
+          <w:bCs/>
+          <w:noProof/>
+          <w:sz w:val="30"/>
+          <w:szCs w:val="30"/>
+        </w:rPr>
+        <w:tab/>
+      </w:r>
+      <w:r>
+        <w:rPr>
+          <w:b/>
+          <w:bCs/>
+          <w:noProof/>
+          <w:sz w:val="30"/>
+          <w:szCs w:val="30"/>
+        </w:rPr>
+        <w:t>vs</w:t>
+      </w:r>
+      <w:r>
+        <w:rPr>
+          <w:b/>
+          <w:bCs/>
+          <w:noProof/>
+          <w:sz w:val="30"/>
+          <w:szCs w:val="30"/>
+        </w:rPr>
+        <w:tab/>
+      </w:r>
+      <w:r>
+        <w:rPr>
+          <w:b/>
+          <w:bCs/>
+          <w:noProof/>
+          <w:sz w:val="30"/>
+          <w:szCs w:val="30"/>
+        </w:rPr>
+        <w:t xml:space="preserve"> PATCH</w:t>
+      </w:r>
+    </w:p>
+    <w:p>
+      <w:pPr>
+        <w:rPr>
+          <w:noProof/>
+        </w:rPr>
+      </w:pPr>
+      <w:r>
+        <w:rPr>
+          <w:noProof/>
+        </w:rPr>
+        <w:t xml:space="preserve">Complete data update </w:t>
+      </w:r>
+      <w:r>
+        <w:rPr>
+          <w:noProof/>
+        </w:rPr>
+        <w:tab/>
+      </w:r>
+      <w:r>
+        <w:rPr>
+          <w:noProof/>
+        </w:rPr>
+        <w:tab/>
+        <w:t>Partial data updation</w:t>
+      </w:r>
+    </w:p>
+    <w:p>
+      <w:pPr>
+        <w:rPr>
+          <w:noProof/>
+        </w:rPr>
+      </w:pPr>
+    </w:p>
+    <w:p>
+      <w:pPr>
+        <w:rPr>
+          <w:b/>
+          <w:bCs/>
+          <w:i/>
+          <w:iCs/>
+          <w:noProof/>
+          <w:color w:val="385623" w:themeColor="accent6" w:themeShade="80"/>
+          <w:sz w:val="40"/>
+          <w:szCs w:val="40"/>
+          <w:u w:val="single"/>
+        </w:rPr>
+      </w:pPr>
+      <w:r>
+        <w:rPr>
+          <w:b/>
+          <w:bCs/>
+          <w:i/>
+          <w:iCs/>
+          <w:noProof/>
+          <w:color w:val="385623" w:themeColor="accent6" w:themeShade="80"/>
+          <w:sz w:val="40"/>
+          <w:szCs w:val="40"/>
+          <w:u w:val="single"/>
+        </w:rPr>
+        <w:t xml:space="preserve">PRACTICE OF ALL LECTURE IN </w:t>
+      </w:r>
+      <w:r>
+        <w:rPr>
+          <w:b/>
+          <w:bCs/>
+          <w:i/>
+          <w:iCs/>
+          <w:noProof/>
+          <w:color w:val="385623" w:themeColor="accent6" w:themeShade="80"/>
+          <w:sz w:val="40"/>
+          <w:szCs w:val="40"/>
+          <w:u w:val="single"/>
+        </w:rPr>
+        <w:t>COMBINE</w:t>
+      </w:r>
+      <w:r>
+        <w:rPr>
+          <w:b/>
+          <w:bCs/>
+          <w:i/>
+          <w:iCs/>
+          <w:noProof/>
+          <w:color w:val="385623" w:themeColor="accent6" w:themeShade="80"/>
+          <w:sz w:val="40"/>
+          <w:szCs w:val="40"/>
+          <w:u w:val="single"/>
+        </w:rPr>
+        <w:t>D FORM:</w:t>
+      </w:r>
+    </w:p>
+    <w:p>
+      <w:pPr>
+        <w:rPr>
+          <w:b/>
+          <w:bCs/>
+          <w:i/>
+          <w:iCs/>
+          <w:noProof/>
+          <w:color w:val="385623" w:themeColor="accent6" w:themeShade="80"/>
+          <w:sz w:val="40"/>
+          <w:szCs w:val="40"/>
+          <w:u w:val="single"/>
+        </w:rPr>
+      </w:pPr>
+      <w:r>
+        <w:rPr>
+          <w:b/>
+          <w:bCs/>
+          <w:i/>
+          <w:iCs/>
+          <w:noProof/>
+          <w:color w:val="385623" w:themeColor="accent6" w:themeShade="80"/>
+          <w:sz w:val="40"/>
+          <w:szCs w:val="40"/>
+          <w:u w:val="single"/>
         </w:rPr>
         <w:drawing>
-          <wp:inline distT="0" distB="0" distL="0" distR="0" wp14:anchorId="5EA2FD2A" wp14:editId="2DD72241">
-            <wp:extent cx="4896533" cy="2019582"/>
-            <wp:effectExtent l="0" t="0" r="0" b="0"/>
-            <wp:docPr id="34" name="Picture 34"/>
+          <wp:inline distT="0" distB="0" distL="0" distR="0" wp14:anchorId="02D00FE5" wp14:editId="654B2D14">
+            <wp:extent cx="5943600" cy="905510"/>
+            <wp:effectExtent l="0" t="0" r="0" b="8890"/>
+            <wp:docPr id="41" name="Picture 41"/>
             <wp:cNvGraphicFramePr>
               <a:graphicFrameLocks xmlns:a="http://schemas.openxmlformats.org/drawingml/2006/main" noChangeAspect="1"/>
             </wp:cNvGraphicFramePr>
@@ -6987,7 +7249,7 @@
                   <pic:spPr>
                     <a:xfrm>
                       <a:off x="0" y="0"/>
-                      <a:ext cx="4896533" cy="2019582"/>
+                      <a:ext cx="5943600" cy="905510"/>
                     </a:xfrm>
                     <a:prstGeom prst="rect">
                       <a:avLst/>
@@ -7003,13 +7265,6 @@
     <w:p>
       <w:pPr>
         <w:rPr>
-          <w:noProof/>
-        </w:rPr>
-      </w:pPr>
-    </w:p>
-    <w:p>
-      <w:pPr>
-        <w:rPr>
           <w:b/>
           <w:bCs/>
           <w:i/>
@@ -7033,68 +7288,11 @@
           <w:szCs w:val="40"/>
           <w:u w:val="single"/>
         </w:rPr>
-        <w:t xml:space="preserve">PRACTICE OF ALL LECTURE IN </w:t>
-      </w:r>
-      <w:r>
-        <w:rPr>
-          <w:b/>
-          <w:bCs/>
-          <w:i/>
-          <w:iCs/>
-          <w:noProof/>
-          <w:color w:val="385623" w:themeColor="accent6" w:themeShade="80"/>
-          <w:sz w:val="40"/>
-          <w:szCs w:val="40"/>
-          <w:u w:val="single"/>
-        </w:rPr>
-        <w:t>COMBINE</w:t>
-      </w:r>
-      <w:r>
-        <w:rPr>
-          <w:b/>
-          <w:bCs/>
-          <w:i/>
-          <w:iCs/>
-          <w:noProof/>
-          <w:color w:val="385623" w:themeColor="accent6" w:themeShade="80"/>
-          <w:sz w:val="40"/>
-          <w:szCs w:val="40"/>
-          <w:u w:val="single"/>
-        </w:rPr>
-        <w:t>D FORM:</w:t>
-      </w:r>
-    </w:p>
-    <w:p>
-      <w:pPr>
-        <w:rPr>
-          <w:b/>
-          <w:bCs/>
-          <w:i/>
-          <w:iCs/>
-          <w:noProof/>
-          <w:color w:val="385623" w:themeColor="accent6" w:themeShade="80"/>
-          <w:sz w:val="40"/>
-          <w:szCs w:val="40"/>
-          <w:u w:val="single"/>
-        </w:rPr>
-      </w:pPr>
-      <w:r>
-        <w:rPr>
-          <w:b/>
-          <w:bCs/>
-          <w:i/>
-          <w:iCs/>
-          <w:noProof/>
-          <w:color w:val="385623" w:themeColor="accent6" w:themeShade="80"/>
-          <w:sz w:val="40"/>
-          <w:szCs w:val="40"/>
-          <w:u w:val="single"/>
-        </w:rPr>
         <w:drawing>
-          <wp:inline distT="0" distB="0" distL="0" distR="0" wp14:anchorId="02D00FE5" wp14:editId="654B2D14">
-            <wp:extent cx="5943600" cy="905510"/>
-            <wp:effectExtent l="0" t="0" r="0" b="8890"/>
-            <wp:docPr id="41" name="Picture 41"/>
+          <wp:inline distT="0" distB="0" distL="0" distR="0" wp14:anchorId="5AF250BF" wp14:editId="1D109464">
+            <wp:extent cx="4706007" cy="1600423"/>
+            <wp:effectExtent l="0" t="0" r="0" b="0"/>
+            <wp:docPr id="35" name="Picture 35"/>
             <wp:cNvGraphicFramePr>
               <a:graphicFrameLocks xmlns:a="http://schemas.openxmlformats.org/drawingml/2006/main" noChangeAspect="1"/>
             </wp:cNvGraphicFramePr>
@@ -7114,7 +7312,7 @@
                   <pic:spPr>
                     <a:xfrm>
                       <a:off x="0" y="0"/>
-                      <a:ext cx="5943600" cy="905510"/>
+                      <a:ext cx="4706007" cy="1600423"/>
                     </a:xfrm>
                     <a:prstGeom prst="rect">
                       <a:avLst/>
@@ -7141,23 +7339,23 @@
           <w:u w:val="single"/>
         </w:rPr>
       </w:pPr>
-      <w:r>
-        <w:rPr>
-          <w:b/>
-          <w:bCs/>
-          <w:i/>
-          <w:iCs/>
+    </w:p>
+    <w:p>
+      <w:pPr>
+        <w:rPr>
           <w:noProof/>
-          <w:color w:val="385623" w:themeColor="accent6" w:themeShade="80"/>
-          <w:sz w:val="40"/>
-          <w:szCs w:val="40"/>
-          <w:u w:val="single"/>
-        </w:rPr>
+        </w:rPr>
+      </w:pPr>
+      <w:r>
+        <w:rPr>
+          <w:noProof/>
+        </w:rPr>
+        <w:lastRenderedPageBreak/>
         <w:drawing>
-          <wp:inline distT="0" distB="0" distL="0" distR="0" wp14:anchorId="5AF250BF" wp14:editId="1D109464">
-            <wp:extent cx="4706007" cy="1600423"/>
+          <wp:inline distT="0" distB="0" distL="0" distR="0" wp14:anchorId="16F5C2CD" wp14:editId="6D3EEEF0">
+            <wp:extent cx="5029902" cy="6058746"/>
             <wp:effectExtent l="0" t="0" r="0" b="0"/>
-            <wp:docPr id="35" name="Picture 35"/>
+            <wp:docPr id="42" name="Picture 42"/>
             <wp:cNvGraphicFramePr>
               <a:graphicFrameLocks xmlns:a="http://schemas.openxmlformats.org/drawingml/2006/main" noChangeAspect="1"/>
             </wp:cNvGraphicFramePr>
@@ -7177,68 +7375,6 @@
                   <pic:spPr>
                     <a:xfrm>
                       <a:off x="0" y="0"/>
-                      <a:ext cx="4706007" cy="1600423"/>
-                    </a:xfrm>
-                    <a:prstGeom prst="rect">
-                      <a:avLst/>
-                    </a:prstGeom>
-                  </pic:spPr>
-                </pic:pic>
-              </a:graphicData>
-            </a:graphic>
-          </wp:inline>
-        </w:drawing>
-      </w:r>
-    </w:p>
-    <w:p>
-      <w:pPr>
-        <w:rPr>
-          <w:b/>
-          <w:bCs/>
-          <w:i/>
-          <w:iCs/>
-          <w:noProof/>
-          <w:color w:val="385623" w:themeColor="accent6" w:themeShade="80"/>
-          <w:sz w:val="40"/>
-          <w:szCs w:val="40"/>
-          <w:u w:val="single"/>
-        </w:rPr>
-      </w:pPr>
-    </w:p>
-    <w:p>
-      <w:pPr>
-        <w:rPr>
-          <w:noProof/>
-        </w:rPr>
-      </w:pPr>
-      <w:r>
-        <w:rPr>
-          <w:noProof/>
-        </w:rPr>
-        <w:drawing>
-          <wp:inline distT="0" distB="0" distL="0" distR="0" wp14:anchorId="16F5C2CD" wp14:editId="6D3EEEF0">
-            <wp:extent cx="5029902" cy="6058746"/>
-            <wp:effectExtent l="0" t="0" r="0" b="0"/>
-            <wp:docPr id="42" name="Picture 42"/>
-            <wp:cNvGraphicFramePr>
-              <a:graphicFrameLocks xmlns:a="http://schemas.openxmlformats.org/drawingml/2006/main" noChangeAspect="1"/>
-            </wp:cNvGraphicFramePr>
-            <a:graphic xmlns:a="http://schemas.openxmlformats.org/drawingml/2006/main">
-              <a:graphicData uri="http://schemas.openxmlformats.org/drawingml/2006/picture">
-                <pic:pic xmlns:pic="http://schemas.openxmlformats.org/drawingml/2006/picture">
-                  <pic:nvPicPr>
-                    <pic:cNvPr id="1" name=""/>
-                    <pic:cNvPicPr/>
-                  </pic:nvPicPr>
-                  <pic:blipFill>
-                    <a:blip r:embed="rId33"/>
-                    <a:stretch>
-                      <a:fillRect/>
-                    </a:stretch>
-                  </pic:blipFill>
-                  <pic:spPr>
-                    <a:xfrm>
-                      <a:off x="0" y="0"/>
                       <a:ext cx="5029902" cy="6058746"/>
                     </a:xfrm>
                     <a:prstGeom prst="rect">
@@ -7297,7 +7433,7 @@
                     <pic:cNvPicPr/>
                   </pic:nvPicPr>
                   <pic:blipFill>
-                    <a:blip r:embed="rId34"/>
+                    <a:blip r:embed="rId33"/>
                     <a:stretch>
                       <a:fillRect/>
                     </a:stretch>

</xml_diff>

<commit_message>
Implement basic Todo CRUD operations with FastAPI
</commit_message>
<xml_diff>
--- a/notes/FastAPI notes.docx
+++ b/notes/FastAPI notes.docx
@@ -3485,6 +3485,39 @@
     </w:p>
     <w:p>
       <w:pPr>
+        <w:ind w:firstLine="720"/>
+        <w:rPr>
+          <w:sz w:val="24"/>
+          <w:szCs w:val="24"/>
+        </w:rPr>
+      </w:pPr>
+      <w:r>
+        <w:rPr>
+          <w:b/>
+          <w:bCs/>
+          <w:sz w:val="24"/>
+          <w:szCs w:val="24"/>
+        </w:rPr>
+        <w:t>Symbol:</w:t>
+      </w:r>
+      <w:r>
+        <w:rPr>
+          <w:sz w:val="24"/>
+          <w:szCs w:val="24"/>
+        </w:rPr>
+        <w:t xml:space="preserve"> {}</w:t>
+      </w:r>
+      <w:r>
+        <w:rPr>
+          <w:sz w:val="24"/>
+          <w:szCs w:val="24"/>
+        </w:rPr>
+        <w:tab/>
+        <w:t>ye must h</w:t>
+      </w:r>
+    </w:p>
+    <w:p>
+      <w:pPr>
         <w:rPr>
           <w:b/>
           <w:bCs/>
@@ -3747,6 +3780,7 @@
           <w:sz w:val="27"/>
           <w:szCs w:val="27"/>
         </w:rPr>
+        <w:lastRenderedPageBreak/>
         <w:t>def</w:t>
       </w:r>
       <w:r>
@@ -3813,7 +3847,6 @@
           <w:sz w:val="27"/>
           <w:szCs w:val="27"/>
         </w:rPr>
-        <w:lastRenderedPageBreak/>
         <w:t xml:space="preserve">    </w:t>
       </w:r>
       <w:r>
@@ -6992,9 +7025,9 @@
           <w:noProof/>
         </w:rPr>
         <w:drawing>
-          <wp:inline distT="0" distB="0" distL="0" distR="0" wp14:anchorId="5EA2FD2A" wp14:editId="2DD72241">
-            <wp:extent cx="4896533" cy="2019582"/>
-            <wp:effectExtent l="0" t="0" r="0" b="0"/>
+          <wp:inline distT="0" distB="0" distL="0" distR="0" wp14:anchorId="5EA2FD2A" wp14:editId="0CA52581">
+            <wp:extent cx="4125773" cy="1701681"/>
+            <wp:effectExtent l="0" t="0" r="8255" b="0"/>
             <wp:docPr id="34" name="Picture 34"/>
             <wp:cNvGraphicFramePr>
               <a:graphicFrameLocks xmlns:a="http://schemas.openxmlformats.org/drawingml/2006/main" noChangeAspect="1"/>
@@ -7015,7 +7048,7 @@
                   <pic:spPr>
                     <a:xfrm>
                       <a:off x="0" y="0"/>
-                      <a:ext cx="4896533" cy="2019582"/>
+                      <a:ext cx="4129204" cy="1703096"/>
                     </a:xfrm>
                     <a:prstGeom prst="rect">
                       <a:avLst/>
@@ -7138,9 +7171,50 @@
     <w:p>
       <w:pPr>
         <w:rPr>
+          <w:b/>
+          <w:bCs/>
           <w:noProof/>
         </w:rPr>
       </w:pPr>
+      <w:r>
+        <w:rPr>
+          <w:b/>
+          <w:bCs/>
+          <w:noProof/>
+        </w:rPr>
+        <w:t>How we are doing CRUD operation w/o using DB ?</w:t>
+      </w:r>
+    </w:p>
+    <w:p>
+      <w:pPr>
+        <w:rPr>
+          <w:noProof/>
+        </w:rPr>
+      </w:pPr>
+      <w:r>
+        <w:rPr>
+          <w:noProof/>
+        </w:rPr>
+        <w:t>By using Temporary list,</w:t>
+      </w:r>
+      <w:r>
+        <w:rPr>
+          <w:noProof/>
+        </w:rPr>
+        <w:t xml:space="preserve"> using</w:t>
+      </w:r>
+      <w:r>
+        <w:rPr>
+          <w:noProof/>
+        </w:rPr>
+        <w:t xml:space="preserve"> in-memory</w:t>
+      </w:r>
+      <w:r>
+        <w:rPr>
+          <w:noProof/>
+        </w:rPr>
+        <w:t xml:space="preserve"> storage which gives the real-db type feeling but no actual db used</w:t>
+      </w:r>
     </w:p>
     <w:p>
       <w:pPr>
@@ -7226,9 +7300,9 @@
           <w:u w:val="single"/>
         </w:rPr>
         <w:drawing>
-          <wp:inline distT="0" distB="0" distL="0" distR="0" wp14:anchorId="02D00FE5" wp14:editId="654B2D14">
-            <wp:extent cx="5943600" cy="905510"/>
-            <wp:effectExtent l="0" t="0" r="0" b="8890"/>
+          <wp:inline distT="0" distB="0" distL="0" distR="0" wp14:anchorId="02D00FE5" wp14:editId="64F6D2BF">
+            <wp:extent cx="5329738" cy="811988"/>
+            <wp:effectExtent l="0" t="0" r="4445" b="7620"/>
             <wp:docPr id="41" name="Picture 41"/>
             <wp:cNvGraphicFramePr>
               <a:graphicFrameLocks xmlns:a="http://schemas.openxmlformats.org/drawingml/2006/main" noChangeAspect="1"/>
@@ -7249,7 +7323,7 @@
                   <pic:spPr>
                     <a:xfrm>
                       <a:off x="0" y="0"/>
-                      <a:ext cx="5943600" cy="905510"/>
+                      <a:ext cx="5375264" cy="818924"/>
                     </a:xfrm>
                     <a:prstGeom prst="rect">
                       <a:avLst/>
@@ -7264,6 +7338,248 @@
     </w:p>
     <w:p>
       <w:pPr>
+        <w:shd w:val="clear" w:color="auto" w:fill="121314"/>
+        <w:spacing w:after="0" w:line="360" w:lineRule="atLeast"/>
+        <w:rPr>
+          <w:rFonts w:ascii="Consolas" w:eastAsia="Times New Roman" w:hAnsi="Consolas" w:cs="Times New Roman"/>
+          <w:color w:val="2F5496" w:themeColor="accent1" w:themeShade="BF"/>
+          <w:sz w:val="27"/>
+          <w:szCs w:val="27"/>
+        </w:rPr>
+      </w:pPr>
+      <w:r>
+        <w:rPr>
+          <w:rFonts w:ascii="Consolas" w:eastAsia="Times New Roman" w:hAnsi="Consolas" w:cs="Times New Roman"/>
+          <w:color w:val="2F5496" w:themeColor="accent1" w:themeShade="BF"/>
+          <w:sz w:val="27"/>
+          <w:szCs w:val="27"/>
+          <w:highlight w:val="yellow"/>
+        </w:rPr>
+        <w:t xml:space="preserve"># </w:t>
+      </w:r>
+      <w:proofErr w:type="spellStart"/>
+      <w:r>
+        <w:rPr>
+          <w:rFonts w:ascii="Consolas" w:eastAsia="Times New Roman" w:hAnsi="Consolas" w:cs="Times New Roman"/>
+          <w:color w:val="2F5496" w:themeColor="accent1" w:themeShade="BF"/>
+          <w:sz w:val="27"/>
+          <w:szCs w:val="27"/>
+          <w:highlight w:val="yellow"/>
+        </w:rPr>
+        <w:t>FastAPI</w:t>
+      </w:r>
+      <w:proofErr w:type="spellEnd"/>
+      <w:r>
+        <w:rPr>
+          <w:rFonts w:ascii="Consolas" w:eastAsia="Times New Roman" w:hAnsi="Consolas" w:cs="Times New Roman"/>
+          <w:color w:val="2F5496" w:themeColor="accent1" w:themeShade="BF"/>
+          <w:sz w:val="27"/>
+          <w:szCs w:val="27"/>
+          <w:highlight w:val="yellow"/>
+        </w:rPr>
+        <w:t xml:space="preserve"> Request Parameter Handling: Path + Query + Request Body</w:t>
+      </w:r>
+    </w:p>
+    <w:p>
+      <w:pPr>
+        <w:shd w:val="clear" w:color="auto" w:fill="121314"/>
+        <w:spacing w:after="0" w:line="360" w:lineRule="atLeast"/>
+        <w:rPr>
+          <w:rFonts w:ascii="Consolas" w:eastAsia="Times New Roman" w:hAnsi="Consolas" w:cs="Times New Roman"/>
+          <w:color w:val="BBBEBF"/>
+          <w:sz w:val="27"/>
+          <w:szCs w:val="27"/>
+        </w:rPr>
+      </w:pPr>
+      <w:r>
+        <w:rPr>
+          <w:rFonts w:ascii="Consolas" w:eastAsia="Times New Roman" w:hAnsi="Consolas" w:cs="Times New Roman"/>
+          <w:color w:val="8B949E"/>
+          <w:sz w:val="27"/>
+          <w:szCs w:val="27"/>
+        </w:rPr>
+        <w:t xml:space="preserve"># </w:t>
+      </w:r>
+      <w:proofErr w:type="spellStart"/>
+      <w:proofErr w:type="gramStart"/>
+      <w:r>
+        <w:rPr>
+          <w:rFonts w:ascii="Consolas" w:eastAsia="Times New Roman" w:hAnsi="Consolas" w:cs="Times New Roman"/>
+          <w:color w:val="8B949E"/>
+          <w:sz w:val="27"/>
+          <w:szCs w:val="27"/>
+        </w:rPr>
+        <w:t>eg</w:t>
+      </w:r>
+      <w:proofErr w:type="spellEnd"/>
+      <w:proofErr w:type="gramEnd"/>
+      <w:r>
+        <w:rPr>
+          <w:rFonts w:ascii="Consolas" w:eastAsia="Times New Roman" w:hAnsi="Consolas" w:cs="Times New Roman"/>
+          <w:color w:val="8B949E"/>
+          <w:sz w:val="27"/>
+          <w:szCs w:val="27"/>
+        </w:rPr>
+        <w:t xml:space="preserve">; </w:t>
+      </w:r>
+      <w:r>
+        <w:rPr>
+          <w:rFonts w:ascii="Consolas" w:eastAsia="Times New Roman" w:hAnsi="Consolas" w:cs="Times New Roman"/>
+          <w:color w:val="8B949E"/>
+          <w:sz w:val="27"/>
+          <w:szCs w:val="27"/>
+        </w:rPr>
+        <w:t>PUT /</w:t>
+      </w:r>
+      <w:r>
+        <w:rPr>
+          <w:rFonts w:ascii="Consolas" w:eastAsia="Times New Roman" w:hAnsi="Consolas" w:cs="Times New Roman"/>
+          <w:color w:val="8B949E"/>
+          <w:sz w:val="27"/>
+          <w:szCs w:val="27"/>
+        </w:rPr>
+        <w:t>user</w:t>
+      </w:r>
+      <w:r>
+        <w:rPr>
+          <w:rFonts w:ascii="Consolas" w:eastAsia="Times New Roman" w:hAnsi="Consolas" w:cs="Times New Roman"/>
+          <w:color w:val="8B949E"/>
+          <w:sz w:val="27"/>
+          <w:szCs w:val="27"/>
+        </w:rPr>
+        <w:t>/{id}?notify=true</w:t>
+      </w:r>
+      <w:r>
+        <w:rPr>
+          <w:rFonts w:ascii="Consolas" w:eastAsia="Times New Roman" w:hAnsi="Consolas" w:cs="Times New Roman"/>
+          <w:color w:val="8B949E"/>
+          <w:sz w:val="27"/>
+          <w:szCs w:val="27"/>
+        </w:rPr>
+        <w:t xml:space="preserve">. </w:t>
+      </w:r>
+      <w:r>
+        <w:rPr>
+          <w:rFonts w:ascii="Consolas" w:eastAsia="Times New Roman" w:hAnsi="Consolas" w:cs="Times New Roman"/>
+          <w:color w:val="8B949E"/>
+          <w:sz w:val="27"/>
+          <w:szCs w:val="27"/>
+        </w:rPr>
+        <w:t>Path parameter[id] + Query parameter[notify] + Request Body[</w:t>
+      </w:r>
+      <w:proofErr w:type="spellStart"/>
+      <w:r>
+        <w:rPr>
+          <w:rFonts w:ascii="Consolas" w:eastAsia="Times New Roman" w:hAnsi="Consolas" w:cs="Times New Roman"/>
+          <w:color w:val="8B949E"/>
+          <w:sz w:val="27"/>
+          <w:szCs w:val="27"/>
+        </w:rPr>
+        <w:t>update_</w:t>
+      </w:r>
+      <w:r>
+        <w:rPr>
+          <w:rFonts w:ascii="Consolas" w:eastAsia="Times New Roman" w:hAnsi="Consolas" w:cs="Times New Roman"/>
+          <w:color w:val="8B949E"/>
+          <w:sz w:val="27"/>
+          <w:szCs w:val="27"/>
+        </w:rPr>
+        <w:t>user</w:t>
+      </w:r>
+      <w:proofErr w:type="spellEnd"/>
+      <w:r>
+        <w:rPr>
+          <w:rFonts w:ascii="Consolas" w:eastAsia="Times New Roman" w:hAnsi="Consolas" w:cs="Times New Roman"/>
+          <w:color w:val="8B949E"/>
+          <w:sz w:val="27"/>
+          <w:szCs w:val="27"/>
+        </w:rPr>
+        <w:t>]</w:t>
+      </w:r>
+    </w:p>
+    <w:p>
+      <w:pPr>
+        <w:rPr>
+          <w:noProof/>
+          <w:sz w:val="24"/>
+          <w:szCs w:val="24"/>
+        </w:rPr>
+      </w:pPr>
+      <w:r>
+        <w:rPr>
+          <w:b/>
+          <w:bCs/>
+          <w:noProof/>
+          <w:sz w:val="24"/>
+          <w:szCs w:val="24"/>
+        </w:rPr>
+        <w:t>Path:</w:t>
+      </w:r>
+      <w:r>
+        <w:rPr>
+          <w:noProof/>
+          <w:sz w:val="24"/>
+          <w:szCs w:val="24"/>
+        </w:rPr>
+        <w:t xml:space="preserve"> resource identify krna jesa kis id </w:t>
+      </w:r>
+    </w:p>
+    <w:p>
+      <w:pPr>
+        <w:rPr>
+          <w:noProof/>
+          <w:sz w:val="24"/>
+          <w:szCs w:val="24"/>
+        </w:rPr>
+      </w:pPr>
+      <w:r>
+        <w:rPr>
+          <w:b/>
+          <w:bCs/>
+          <w:noProof/>
+          <w:sz w:val="24"/>
+          <w:szCs w:val="24"/>
+        </w:rPr>
+        <w:t>Query:</w:t>
+      </w:r>
+      <w:r>
+        <w:rPr>
+          <w:noProof/>
+          <w:sz w:val="24"/>
+          <w:szCs w:val="24"/>
+        </w:rPr>
+        <w:t xml:space="preserve"> options/filter</w:t>
+      </w:r>
+    </w:p>
+    <w:p>
+      <w:pPr>
+        <w:rPr>
+          <w:noProof/>
+          <w:sz w:val="24"/>
+          <w:szCs w:val="24"/>
+        </w:rPr>
+      </w:pPr>
+      <w:r>
+        <w:rPr>
+          <w:b/>
+          <w:bCs/>
+          <w:noProof/>
+          <w:sz w:val="24"/>
+          <w:szCs w:val="24"/>
+        </w:rPr>
+        <w:t>Body:</w:t>
+      </w:r>
+      <w:r>
+        <w:rPr>
+          <w:noProof/>
+          <w:sz w:val="24"/>
+          <w:szCs w:val="24"/>
+        </w:rPr>
+        <w:t xml:space="preserve"> data send here</w:t>
+      </w:r>
+    </w:p>
+    <w:p>
+      <w:pPr>
         <w:rPr>
           <w:b/>
           <w:bCs/>
@@ -7289,9 +7605,9 @@
           <w:u w:val="single"/>
         </w:rPr>
         <w:drawing>
-          <wp:inline distT="0" distB="0" distL="0" distR="0" wp14:anchorId="5AF250BF" wp14:editId="1D109464">
-            <wp:extent cx="4706007" cy="1600423"/>
-            <wp:effectExtent l="0" t="0" r="0" b="0"/>
+          <wp:inline distT="0" distB="0" distL="0" distR="0" wp14:anchorId="5AF250BF" wp14:editId="00F615CF">
+            <wp:extent cx="3525926" cy="1199101"/>
+            <wp:effectExtent l="0" t="0" r="0" b="1270"/>
             <wp:docPr id="35" name="Picture 35"/>
             <wp:cNvGraphicFramePr>
               <a:graphicFrameLocks xmlns:a="http://schemas.openxmlformats.org/drawingml/2006/main" noChangeAspect="1"/>
@@ -7312,7 +7628,7 @@
                   <pic:spPr>
                     <a:xfrm>
                       <a:off x="0" y="0"/>
-                      <a:ext cx="4706007" cy="1600423"/>
+                      <a:ext cx="3535150" cy="1202238"/>
                     </a:xfrm>
                     <a:prstGeom prst="rect">
                       <a:avLst/>
@@ -7324,21 +7640,6 @@
           </wp:inline>
         </w:drawing>
       </w:r>
-    </w:p>
-    <w:p>
-      <w:pPr>
-        <w:rPr>
-          <w:b/>
-          <w:bCs/>
-          <w:i/>
-          <w:iCs/>
-          <w:noProof/>
-          <w:color w:val="385623" w:themeColor="accent6" w:themeShade="80"/>
-          <w:sz w:val="40"/>
-          <w:szCs w:val="40"/>
-          <w:u w:val="single"/>
-        </w:rPr>
-      </w:pPr>
     </w:p>
     <w:p>
       <w:pPr>

</xml_diff>